<commit_message>
Lets see what we get now
</commit_message>
<xml_diff>
--- a/docassemble/RespondingChildCustodyActionPlan/data/templates/responding_child_custody_action_plan.docx
+++ b/docassemble/RespondingChildCustodyActionPlan/data/templates/responding_child_custody_action_plan.docx
@@ -39,10 +39,58 @@
               <w:spacing w:after="0"/>
             </w:pPr>
             <w:r>
-              <w:t>Responding i</w:t>
-            </w:r>
-            <w:r>
-              <w:t>n your custody case</w:t>
+              <w:rPr>
+                <w:color w:val="FF0000"/>
+              </w:rPr>
+              <w:t>{</w:t>
+            </w:r>
+            <w:r>
+              <w:rPr>
+                <w:color w:val="FF0000"/>
+              </w:rPr>
+              <w:t>% if type_of_response.any_true()</w:t>
+            </w:r>
+            <w:r>
+              <w:rPr>
+                <w:color w:val="FF0000"/>
+              </w:rPr>
+              <w:t xml:space="preserve"> %}</w:t>
+            </w:r>
+            <w:r>
+              <w:t>R</w:t>
+            </w:r>
+            <w:r>
+              <w:t>espond in your child custody case</w:t>
+            </w:r>
+            <w:r>
+              <w:rPr>
+                <w:color w:val="FF0000"/>
+              </w:rPr>
+              <w:t>{% else %}</w:t>
+            </w:r>
+            <w:r>
+              <w:t>R</w:t>
+            </w:r>
+            <w:r>
+              <w:t>espond when the other parent has not started a custody case yet, but wants to see if you can agree on a Parenting Plan and custody order</w:t>
+            </w:r>
+            <w:r>
+              <w:rPr>
+                <w:color w:val="FF0000"/>
+              </w:rPr>
+              <w:t>{</w:t>
+            </w:r>
+            <w:r>
+              <w:rPr>
+                <w:color w:val="FF0000"/>
+              </w:rPr>
+              <w:t>% endif</w:t>
+            </w:r>
+            <w:r>
+              <w:rPr>
+                <w:color w:val="FF0000"/>
+              </w:rPr>
+              <w:t xml:space="preserve"> %}</w:t>
             </w:r>
           </w:p>
         </w:tc>
@@ -806,6 +854,7 @@
               <w:t xml:space="preserve">{{ </w:t>
             </w:r>
             <w:r>
+              <w:lastRenderedPageBreak/>
               <w:t>proper_service_step</w:t>
             </w:r>
             <w:r>
@@ -840,6 +889,7 @@
               <w:spacing w:before="100" w:after="100"/>
             </w:pPr>
             <w:r>
+              <w:lastRenderedPageBreak/>
               <w:t>{{p (include_docx_template("</w:t>
             </w:r>
             <w:r>
@@ -882,6 +932,7 @@
               </w:rPr>
             </w:pPr>
             <w:r>
+              <w:lastRenderedPageBreak/>
               <w:t>{%tr endif %}</w:t>
             </w:r>
           </w:p>
@@ -979,98 +1030,90 @@
                 <w:rFonts w:eastAsia="Helvetica"/>
                 <w:color w:val="FFC000"/>
               </w:rPr>
-              <w:t xml:space="preserve">type_of_response.true_values().number() </w:t>
+              <w:t xml:space="preserve">type_of_response.true_values().number() == </w:t>
             </w:r>
             <w:r>
               <w:rPr>
                 <w:rFonts w:eastAsia="Helvetica"/>
                 <w:color w:val="FFC000"/>
               </w:rPr>
-              <w:lastRenderedPageBreak/>
-              <w:t xml:space="preserve">== </w:t>
+              <w:t>2</w:t>
             </w:r>
             <w:r>
               <w:rPr>
                 <w:rFonts w:eastAsia="Helvetica"/>
                 <w:color w:val="FFC000"/>
               </w:rPr>
-              <w:t>2</w:t>
+              <w:t xml:space="preserve"> </w:t>
             </w:r>
             <w:r>
               <w:rPr>
                 <w:rFonts w:eastAsia="Helvetica"/>
                 <w:color w:val="FFC000"/>
               </w:rPr>
-              <w:t xml:space="preserve"> </w:t>
+              <w:t xml:space="preserve">and </w:t>
             </w:r>
             <w:r>
               <w:rPr>
                 <w:rFonts w:eastAsia="Helvetica"/>
                 <w:color w:val="FFC000"/>
               </w:rPr>
-              <w:t xml:space="preserve">and </w:t>
+              <w:t>type_of_response</w:t>
             </w:r>
             <w:r>
               <w:rPr>
                 <w:rFonts w:eastAsia="Helvetica"/>
                 <w:color w:val="FFC000"/>
               </w:rPr>
-              <w:t>type_of_response</w:t>
+              <w:t>[</w:t>
             </w:r>
             <w:r>
               <w:rPr>
                 <w:rFonts w:eastAsia="Helvetica"/>
                 <w:color w:val="FFC000"/>
               </w:rPr>
-              <w:t>[</w:t>
+              <w:t>'improper service'</w:t>
             </w:r>
             <w:r>
               <w:rPr>
                 <w:rFonts w:eastAsia="Helvetica"/>
                 <w:color w:val="FFC000"/>
               </w:rPr>
-              <w:t>'improper service'</w:t>
+              <w:t>] and</w:t>
             </w:r>
             <w:r>
               <w:rPr>
                 <w:rFonts w:eastAsia="Helvetica"/>
                 <w:color w:val="FFC000"/>
               </w:rPr>
-              <w:t>] and</w:t>
+              <w:t xml:space="preserve"> type_of_response</w:t>
             </w:r>
             <w:r>
               <w:rPr>
                 <w:rFonts w:eastAsia="Helvetica"/>
                 <w:color w:val="FFC000"/>
               </w:rPr>
-              <w:t xml:space="preserve"> type_of_response</w:t>
+              <w:t>[</w:t>
             </w:r>
             <w:r>
               <w:rPr>
                 <w:rFonts w:eastAsia="Helvetica"/>
                 <w:color w:val="FFC000"/>
               </w:rPr>
-              <w:t>[</w:t>
+              <w:t>'wrong state'</w:t>
             </w:r>
             <w:r>
               <w:rPr>
                 <w:rFonts w:eastAsia="Helvetica"/>
                 <w:color w:val="FFC000"/>
               </w:rPr>
-              <w:t>'wrong state'</w:t>
+              <w:t xml:space="preserve">] </w:t>
             </w:r>
             <w:r>
               <w:rPr>
                 <w:rFonts w:eastAsia="Helvetica"/>
                 <w:color w:val="FFC000"/>
               </w:rPr>
-              <w:t xml:space="preserve">] </w:t>
-            </w:r>
-            <w:r>
-              <w:rPr>
-                <w:rFonts w:eastAsia="Helvetica"/>
-                <w:color w:val="FFC000"/>
-              </w:rPr>
               <w:t>and not proper_service</w:t>
             </w:r>
             <w:r>
@@ -1116,7 +1159,6 @@
               <w:pStyle w:val="Body"/>
             </w:pPr>
             <w:r>
-              <w:lastRenderedPageBreak/>
               <w:t>decide_after_improper_service_step</w:t>
             </w:r>
           </w:p>
@@ -1500,7 +1542,14 @@
               <w:rPr>
                 <w:rFonts w:eastAsia="Calibri"/>
               </w:rPr>
-              <w:t>{{ default_options_step.subject }}</w:t>
+              <w:t xml:space="preserve">{{ default_options_step.subject </w:t>
+            </w:r>
+            <w:r>
+              <w:rPr>
+                <w:rFonts w:eastAsia="Calibri"/>
+              </w:rPr>
+              <w:lastRenderedPageBreak/>
+              <w:t>}}</w:t>
             </w:r>
           </w:p>
         </w:tc>
@@ -1531,7 +1580,11 @@
               <w:spacing w:before="280" w:after="0"/>
             </w:pPr>
             <w:r>
-              <w:t>{{p (include_docx_template("docassemble.AKA2JBranding:default_options_content.docx")) }}</w:t>
+              <w:t>{{p (include_docx_template("docassemble.AKA2JBranding:default_option</w:t>
+            </w:r>
+            <w:r>
+              <w:lastRenderedPageBreak/>
+              <w:t>s_content.docx")) }}</w:t>
             </w:r>
           </w:p>
         </w:tc>
@@ -1562,6 +1615,7 @@
               <w:spacing w:before="0" w:after="0"/>
             </w:pPr>
             <w:r>
+              <w:lastRenderedPageBreak/>
               <w:t>{%tr endif %}</w:t>
             </w:r>
           </w:p>
@@ -1687,19 +1741,12 @@
               <w:rPr>
                 <w:shd w:val="clear" w:color="auto" w:fill="FFFFFF"/>
               </w:rPr>
-              <w:t>learn_set_asid</w:t>
+              <w:t>learn_set_aside_step</w:t>
             </w:r>
             <w:r>
               <w:rPr>
                 <w:shd w:val="clear" w:color="auto" w:fill="FFFFFF"/>
               </w:rPr>
-              <w:lastRenderedPageBreak/>
-              <w:t>e_step</w:t>
-            </w:r>
-            <w:r>
-              <w:rPr>
-                <w:shd w:val="clear" w:color="auto" w:fill="FFFFFF"/>
-              </w:rPr>
               <w:t>.subject }}</w:t>
             </w:r>
           </w:p>
@@ -1736,11 +1783,7 @@
               <w:t>docassemble</w:t>
             </w:r>
             <w:r>
-              <w:t>.AKA2JBranding:learn_set_asid</w:t>
-            </w:r>
-            <w:r>
-              <w:lastRenderedPageBreak/>
-              <w:t>e_content</w:t>
+              <w:t>.AKA2JBranding:learn_set_aside_content</w:t>
             </w:r>
             <w:r>
               <w:t>.docx</w:t>
@@ -1779,7 +1822,6 @@
               <w:rPr>
                 <w:shd w:val="clear" w:color="auto" w:fill="FFFFFF"/>
               </w:rPr>
-              <w:lastRenderedPageBreak/>
               <w:t>{{ fill</w:t>
             </w:r>
             <w:r>
@@ -2144,6 +2186,7 @@
               <w:rPr>
                 <w:color w:val="00B050"/>
               </w:rPr>
+              <w:lastRenderedPageBreak/>
               <w:t>(</w:t>
             </w:r>
             <w:r>
@@ -2231,11 +2274,7 @@
               <w:t>type_of_response</w:t>
             </w:r>
             <w:r>
-              <w:t>['ca</w:t>
-            </w:r>
-            <w:r>
-              <w:lastRenderedPageBreak/>
-              <w:t xml:space="preserve">se in 2 states'] and </w:t>
+              <w:t xml:space="preserve">['case in 2 states'] and </w:t>
             </w:r>
             <w:r>
               <w:rPr>
@@ -2574,7 +2613,14 @@
               <w:rPr>
                 <w:color w:val="00B050"/>
               </w:rPr>
-              <w:t>type_of_response['wrong state'] and not residency</w:t>
+              <w:t xml:space="preserve">type_of_response['wrong state'] and not </w:t>
+            </w:r>
+            <w:r>
+              <w:rPr>
+                <w:color w:val="00B050"/>
+              </w:rPr>
+              <w:lastRenderedPageBreak/>
+              <w:t>residency</w:t>
             </w:r>
             <w:r>
               <w:rPr>
@@ -2664,14 +2710,7 @@
               <w:rPr>
                 <w:color w:val="00B050"/>
               </w:rPr>
-              <w:t>type_of_response['ca</w:t>
-            </w:r>
-            <w:r>
-              <w:rPr>
-                <w:color w:val="00B050"/>
-              </w:rPr>
-              <w:lastRenderedPageBreak/>
-              <w:t>se in 2 states'] and stage_of_other_case in('still going', 'ended with no order')</w:t>
+              <w:t>type_of_response['case in 2 states'] and stage_of_other_case in('still going', 'ended with no order')</w:t>
             </w:r>
             <w:r>
               <w:rPr>
@@ -2933,7 +2972,11 @@
               <w:t>) or (</w:t>
             </w:r>
             <w:r>
-              <w:t>type_of_response['default'] and stage_of_default in('application filed', 'hearing scheduled') and not proper_service</w:t>
+              <w:t xml:space="preserve">type_of_response['default'] and stage_of_default in('application filed', 'hearing scheduled') and not </w:t>
+            </w:r>
+            <w:r>
+              <w:lastRenderedPageBreak/>
+              <w:t>proper_service</w:t>
             </w:r>
             <w:r>
               <w:rPr>
@@ -2968,6 +3011,7 @@
               <w:spacing w:before="0" w:after="0"/>
             </w:pPr>
             <w:r>
+              <w:lastRenderedPageBreak/>
               <w:t>dismiss_step</w:t>
             </w:r>
           </w:p>
@@ -3300,15 +3344,7 @@
                 <w:rFonts w:eastAsia="Calibri"/>
                 <w:shd w:val="clear" w:color="auto" w:fill="FFFFFF"/>
               </w:rPr>
-              <w:t xml:space="preserve">{{ </w:t>
-            </w:r>
-            <w:r>
-              <w:rPr>
-                <w:rFonts w:eastAsia="Calibri"/>
-                <w:shd w:val="clear" w:color="auto" w:fill="FFFFFF"/>
-              </w:rPr>
-              <w:lastRenderedPageBreak/>
-              <w:t>uncontested_custody_forms_step.subject }}</w:t>
+              <w:t>{{ uncontested_custody_forms_step.subject }}</w:t>
             </w:r>
           </w:p>
         </w:tc>
@@ -3715,7 +3751,11 @@
               </w:rPr>
             </w:pPr>
             <w:r>
-              <w:t>{{ truefiling_file_and_serve_step.subject }}</w:t>
+              <w:t>{{ truefiling_file_a</w:t>
+            </w:r>
+            <w:r>
+              <w:lastRenderedPageBreak/>
+              <w:t>nd_serve_step.subject }}</w:t>
             </w:r>
           </w:p>
         </w:tc>
@@ -3745,7 +3785,11 @@
               <w:pStyle w:val="Body"/>
             </w:pPr>
             <w:r>
-              <w:t>{{p (include_docx_template("docassemble.AKA2JBranding:truefiling_file_and_serve_content.docx")) }}</w:t>
+              <w:t>{{p (include_docx_template("docassemble.AKA2JBranding:truefiling_file_</w:t>
+            </w:r>
+            <w:r>
+              <w:lastRenderedPageBreak/>
+              <w:t>and_serve_content.docx")) }}</w:t>
             </w:r>
           </w:p>
         </w:tc>
@@ -3778,6 +3822,7 @@
               </w:rPr>
             </w:pPr>
             <w:r>
+              <w:lastRenderedPageBreak/>
               <w:t>{{ truefiling_serve_step.subject }}</w:t>
             </w:r>
           </w:p>
@@ -3939,14 +3984,7 @@
               <w:rPr>
                 <w:color w:val="FF0000"/>
               </w:rPr>
-              <w:t xml:space="preserve">type_of_response.any_true('ak custody </w:t>
-            </w:r>
-            <w:r>
-              <w:rPr>
-                <w:color w:val="FF0000"/>
-              </w:rPr>
-              <w:lastRenderedPageBreak/>
-              <w:t xml:space="preserve">case', 'ak divorce case') or </w:t>
+              <w:t xml:space="preserve">type_of_response.any_true('ak custody case', 'ak divorce case') or </w:t>
             </w:r>
             <w:r>
               <w:rPr>
@@ -4111,7 +4149,14 @@
               <w:rPr>
                 <w:rFonts w:eastAsia="Calibri"/>
               </w:rPr>
-              <w:t>.subject }}</w:t>
+              <w:t>.su</w:t>
+            </w:r>
+            <w:r>
+              <w:rPr>
+                <w:rFonts w:eastAsia="Calibri"/>
+              </w:rPr>
+              <w:lastRenderedPageBreak/>
+              <w:t>bject }}</w:t>
             </w:r>
           </w:p>
         </w:tc>
@@ -4182,6 +4227,7 @@
               </w:rPr>
             </w:pPr>
             <w:r>
+              <w:lastRenderedPageBreak/>
               <w:t>{%tr endif%}</w:t>
             </w:r>
           </w:p>
@@ -4466,91 +4512,84 @@
               <w:rPr>
                 <w:color w:val="FF0000"/>
               </w:rPr>
-              <w:t xml:space="preserve">) </w:t>
+              <w:t xml:space="preserve">) and </w:t>
             </w:r>
             <w:r>
               <w:rPr>
                 <w:color w:val="FF0000"/>
               </w:rPr>
-              <w:lastRenderedPageBreak/>
-              <w:t xml:space="preserve">and </w:t>
+              <w:t>(</w:t>
+            </w:r>
+            <w:r>
+              <w:rPr>
+                <w:color w:val="FFC000"/>
+              </w:rPr>
+              <w:t>type_of_response.any_true('ak custody case', 'ak divorce case') or (</w:t>
+            </w:r>
+            <w:r>
+              <w:rPr>
+                <w:color w:val="92D050"/>
+              </w:rPr>
+              <w:t>user_need in('answer custody', 'answer divorce') and type_of_response.all_true('improper service', exclusive = True)</w:t>
+            </w:r>
+            <w:r>
+              <w:rPr>
+                <w:color w:val="FFC000"/>
+              </w:rPr>
+              <w:t>) or (</w:t>
+            </w:r>
+            <w:r>
+              <w:rPr>
+                <w:color w:val="92D050"/>
+              </w:rPr>
+              <w:t>user_need in('answer custody', 'answer divorce') and (</w:t>
+            </w:r>
+            <w:r>
+              <w:rPr>
+                <w:color w:val="00B050"/>
+              </w:rPr>
+              <w:t>type_of_response['wrong state'] or (</w:t>
+            </w:r>
+            <w:r>
+              <w:rPr>
+                <w:color w:val="00B0F0"/>
+              </w:rPr>
+              <w:t>type_of_response['case in 2 states'] and stage_of_other_case in('still going', 'ended with no order'</w:t>
+            </w:r>
+            <w:r>
+              <w:rPr>
+                <w:color w:val="00B0F0"/>
+              </w:rPr>
+              <w:t>)</w:t>
+            </w:r>
+            <w:r>
+              <w:rPr>
+                <w:color w:val="00B050"/>
+              </w:rPr>
+              <w:t>)</w:t>
+            </w:r>
+            <w:r>
+              <w:rPr>
+                <w:color w:val="92D050"/>
+              </w:rPr>
+              <w:t>)</w:t>
+            </w:r>
+            <w:r>
+              <w:rPr>
+                <w:color w:val="FFC000"/>
+              </w:rPr>
+              <w:t>)</w:t>
             </w:r>
             <w:r>
               <w:rPr>
                 <w:color w:val="FF0000"/>
               </w:rPr>
-              <w:t>(</w:t>
-            </w:r>
-            <w:r>
-              <w:rPr>
-                <w:color w:val="FFC000"/>
-              </w:rPr>
-              <w:t>type_of_response.any_true('ak custody case', 'ak divorce case') or (</w:t>
-            </w:r>
-            <w:r>
-              <w:rPr>
-                <w:color w:val="92D050"/>
-              </w:rPr>
-              <w:t>user_need in('answer custody', 'answer divorce') and type_of_response.all_true('improper service', exclusive = True)</w:t>
-            </w:r>
-            <w:r>
-              <w:rPr>
-                <w:color w:val="FFC000"/>
-              </w:rPr>
-              <w:t>) or (</w:t>
-            </w:r>
-            <w:r>
-              <w:rPr>
-                <w:color w:val="92D050"/>
-              </w:rPr>
-              <w:t>user_need in('answer custody', 'answer divorce') and (</w:t>
-            </w:r>
-            <w:r>
-              <w:rPr>
-                <w:color w:val="00B050"/>
-              </w:rPr>
-              <w:t>type_of_response['wrong state'] or (</w:t>
-            </w:r>
-            <w:r>
-              <w:rPr>
-                <w:color w:val="00B0F0"/>
-              </w:rPr>
-              <w:t>type_of_response['case in 2 states'] and stage_of_other_case in('still going', 'ended with no order'</w:t>
-            </w:r>
-            <w:r>
-              <w:rPr>
-                <w:color w:val="00B0F0"/>
-              </w:rPr>
               <w:t>)</w:t>
             </w:r>
             <w:r>
               <w:rPr>
-                <w:color w:val="00B050"/>
-              </w:rPr>
-              <w:t>)</w:t>
-            </w:r>
-            <w:r>
-              <w:rPr>
-                <w:color w:val="92D050"/>
-              </w:rPr>
-              <w:t>)</w:t>
-            </w:r>
-            <w:r>
-              <w:rPr>
-                <w:color w:val="FFC000"/>
-              </w:rPr>
-              <w:t>)</w:t>
-            </w:r>
-            <w:r>
-              <w:rPr>
                 <w:color w:val="FF0000"/>
               </w:rPr>
-              <w:t>)</w:t>
-            </w:r>
-            <w:r>
-              <w:rPr>
-                <w:color w:val="FF0000"/>
-              </w:rPr>
               <w:t xml:space="preserve"> %}</w:t>
             </w:r>
           </w:p>
@@ -4575,7 +4614,6 @@
               <w:pStyle w:val="Body"/>
             </w:pPr>
             <w:r>
-              <w:lastRenderedPageBreak/>
               <w:t>learn_more_about_</w:t>
             </w:r>
             <w:r>
@@ -4624,12 +4662,19 @@
               <w:rPr>
                 <w:rFonts w:eastAsia="Calibri"/>
               </w:rPr>
-              <w:t>learn_more_about_process_step</w:t>
+              <w:t>learn_more_about_process_st</w:t>
             </w:r>
             <w:r>
               <w:rPr>
                 <w:rFonts w:eastAsia="Calibri"/>
               </w:rPr>
+              <w:lastRenderedPageBreak/>
+              <w:t>ep</w:t>
+            </w:r>
+            <w:r>
+              <w:rPr>
+                <w:rFonts w:eastAsia="Calibri"/>
+              </w:rPr>
               <w:t>.subject }}</w:t>
             </w:r>
           </w:p>
@@ -4654,6 +4699,7 @@
               <w:pStyle w:val="Body"/>
             </w:pPr>
             <w:r>
+              <w:lastRenderedPageBreak/>
               <w:t>{{p (include_docx_template("docassemble.AKA2JBranding:learn_more_about_the_process_content.docx")) }}</w:t>
             </w:r>
           </w:p>
@@ -4687,6 +4733,7 @@
               <w:rPr>
                 <w:shd w:val="clear" w:color="auto" w:fill="FFFFFF"/>
               </w:rPr>
+              <w:lastRenderedPageBreak/>
               <w:t>{%tr endif %}</w:t>
             </w:r>
           </w:p>
@@ -5110,11 +5157,7 @@
               </w:rPr>
             </w:pPr>
             <w:r>
-              <w:t xml:space="preserve">{{ </w:t>
-            </w:r>
-            <w:r>
-              <w:lastRenderedPageBreak/>
-              <w:t>get_help.subject }}</w:t>
+              <w:t>{{ get_help.subject }}</w:t>
             </w:r>
           </w:p>
         </w:tc>
@@ -5145,7 +5188,6 @@
               <w:spacing w:before="100" w:after="100"/>
             </w:pPr>
             <w:r>
-              <w:lastRenderedPageBreak/>
               <w:t>{{p (include_docx_template("docassemble.AKA2JBranding:get_help_content.docx")) }}</w:t>
             </w:r>
           </w:p>
@@ -8096,7 +8138,7 @@
     <w:lsdException w:name="Table Web 2" w:semiHidden="1" w:unhideWhenUsed="1"/>
     <w:lsdException w:name="Table Web 3" w:semiHidden="1" w:unhideWhenUsed="1"/>
     <w:lsdException w:name="Balloon Text" w:semiHidden="1" w:unhideWhenUsed="1"/>
-    <w:lsdException w:name="Table Grid" w:semiHidden="1" w:uiPriority="39" w:unhideWhenUsed="1"/>
+    <w:lsdException w:name="Table Grid" w:uiPriority="39"/>
     <w:lsdException w:name="Table Theme" w:semiHidden="1" w:unhideWhenUsed="1"/>
     <w:lsdException w:name="Placeholder Text" w:semiHidden="1"/>
     <w:lsdException w:name="No Spacing" w:uiPriority="1" w:qFormat="1"/>

</xml_diff>

<commit_message>
still working on getting custody and cases in 2 states and wrong state to show standing order and learn process steps
</commit_message>
<xml_diff>
--- a/docassemble/RespondingChildCustodyActionPlan/data/templates/responding_child_custody_action_plan.docx
+++ b/docassemble/RespondingChildCustodyActionPlan/data/templates/responding_child_custody_action_plan.docx
@@ -496,7 +496,7 @@
                 </mc:Choice>
                 <mc:Fallback>
                   <w:pict>
-                    <v:group w14:anchorId="6E70D74E" id="Group 1" o:spid="_x0000_s1026" style="position:absolute;margin-left:0;margin-top:13.25pt;width:59.8pt;height:54.75pt;z-index:-503316478;mso-wrap-distance-right:25.2pt" coordsize="0,0" o:gfxdata="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">
+                    <v:group w14:anchorId="371A069A" id="Group 1" o:spid="_x0000_s1026" style="position:absolute;margin-left:0;margin-top:13.25pt;width:59.8pt;height:54.75pt;z-index:-503316478;mso-wrap-distance-right:25.2pt" coordsize="0,0" o:gfxdata="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">
                       <v:group id="Group 2" o:spid="_x0000_s1027" style="position:absolute;width:591120;height:694800" coordsize="0,0" o:gfxdata="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">
                         <v:shape id="Freeform 3" o:spid="_x0000_s1028" style="position:absolute;top:41400;width:591120;height:653400;visibility:visible;mso-wrap-style:square;v-text-anchor:top" coordsize="915,1071" o:gfxdata="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" path="m85,89l85,,914,r,985l824,985t,85l,1070,,92r573,l573,337r246,l824,1070xe" filled="f" strokecolor="#333" strokeweight=".44mm">
                           <v:path arrowok="t"/>
@@ -2752,25 +2752,13 @@
               <w:rPr>
                 <w:color w:val="92D050"/>
               </w:rPr>
-              <w:t>stage_of_other_case == ‘ended with order’</w:t>
-            </w:r>
-            <w:r>
-              <w:rPr>
-                <w:color w:val="92D050"/>
-              </w:rPr>
-              <w:t xml:space="preserve"> or (</w:t>
+              <w:t>stage_of_other_case == ‘ended with order’ or (</w:t>
             </w:r>
             <w:r>
               <w:rPr>
                 <w:color w:val="00B050"/>
               </w:rPr>
-              <w:t>stage_of_other_case ==</w:t>
-            </w:r>
-            <w:r>
-              <w:rPr>
-                <w:color w:val="00B050"/>
-              </w:rPr>
-              <w:t xml:space="preserve"> ‘still going</w:t>
+              <w:t>stage_of_other_case == ‘still going</w:t>
             </w:r>
             <w:r>
               <w:rPr>
@@ -4407,79 +4395,67 @@
                 <w:color w:val="FFC000"/>
               </w:rPr>
               <w:lastRenderedPageBreak/>
+              <w:t>stage_of_other_case == ‘ended with order’</w:t>
+            </w:r>
+            <w:r>
+              <w:rPr>
+                <w:color w:val="FF0000"/>
+              </w:rPr>
+              <w:t>)</w:t>
+            </w:r>
+            <w:r>
+              <w:rPr>
+                <w:color w:val="FFC000"/>
+              </w:rPr>
+              <w:t xml:space="preserve"> </w:t>
+            </w:r>
+            <w:r>
+              <w:rPr>
+                <w:color w:val="FF0000"/>
+              </w:rPr>
+              <w:t>and</w:t>
+            </w:r>
+            <w:r>
+              <w:rPr>
+                <w:color w:val="FF0000"/>
+              </w:rPr>
+              <w:t xml:space="preserve"> </w:t>
+            </w:r>
+            <w:r>
+              <w:rPr>
+                <w:color w:val="FF0000"/>
+              </w:rPr>
               <w:t>(</w:t>
             </w:r>
             <w:r>
               <w:rPr>
-                <w:color w:val="92D050"/>
-              </w:rPr>
-              <w:t>stage_of_other_case == ‘ended with order’ or (</w:t>
-            </w:r>
-            <w:r>
-              <w:rPr>
-                <w:color w:val="00B050"/>
-              </w:rPr>
-              <w:t>stage_of_other_case == ‘still going</w:t>
-            </w:r>
-            <w:r>
-              <w:rPr>
-                <w:color w:val="00B050"/>
-              </w:rPr>
-              <w:t>’</w:t>
-            </w:r>
-            <w:r>
-              <w:rPr>
-                <w:color w:val="00B050"/>
-              </w:rPr>
-              <w:t xml:space="preserve"> and not jurisdiction</w:t>
-            </w:r>
-            <w:r>
-              <w:rPr>
-                <w:color w:val="92D050"/>
-              </w:rPr>
-              <w:t>)</w:t>
-            </w:r>
-            <w:r>
-              <w:rPr>
                 <w:color w:val="FFC000"/>
               </w:rPr>
-              <w:t>)</w:t>
-            </w:r>
-            <w:r>
-              <w:rPr>
-                <w:color w:val="FF0000"/>
-              </w:rPr>
-              <w:t>)</w:t>
+              <w:t>type_of_response</w:t>
             </w:r>
             <w:r>
               <w:rPr>
                 <w:color w:val="FFC000"/>
               </w:rPr>
-              <w:t xml:space="preserve"> </w:t>
-            </w:r>
-            <w:r>
-              <w:rPr>
-                <w:color w:val="FF0000"/>
-              </w:rPr>
-              <w:t>and not</w:t>
-            </w:r>
-            <w:r>
-              <w:rPr>
-                <w:color w:val="FF0000"/>
-              </w:rPr>
-              <w:t xml:space="preserve"> </w:t>
-            </w:r>
-            <w:r>
-              <w:rPr>
-                <w:color w:val="FF0000"/>
-              </w:rPr>
-              <w:t>(</w:t>
+              <w:t>.all_false(</w:t>
             </w:r>
             <w:r>
               <w:rPr>
                 <w:color w:val="FFC000"/>
               </w:rPr>
-              <w:t>type_of_response[‘wrong state’] and not jurisdiction</w:t>
+              <w:t>‘wrong state’</w:t>
+            </w:r>
+            <w:r>
+              <w:rPr>
+                <w:color w:val="FFC000"/>
+              </w:rPr>
+              <w:t xml:space="preserve">, ‘default’) </w:t>
+            </w:r>
+            <w:r>
+              <w:rPr>
+                <w:color w:val="FFC000"/>
+              </w:rPr>
+              <w:t>and not jurisdiction</w:t>
             </w:r>
             <w:r>
               <w:rPr>
@@ -5065,12 +5041,19 @@
               <w:rPr>
                 <w:color w:val="FF0000"/>
               </w:rPr>
-              <w:t>) and not</w:t>
+              <w:t xml:space="preserve">) </w:t>
             </w:r>
             <w:r>
               <w:rPr>
                 <w:color w:val="FF0000"/>
               </w:rPr>
+              <w:lastRenderedPageBreak/>
+              <w:t>and not</w:t>
+            </w:r>
+            <w:r>
+              <w:rPr>
+                <w:color w:val="FF0000"/>
+              </w:rPr>
               <w:t xml:space="preserve"> </w:t>
             </w:r>
             <w:r>
@@ -5113,109 +5096,97 @@
               <w:rPr>
                 <w:color w:val="FFC000"/>
               </w:rPr>
+              <w:t>stage_of_other_case == ‘ended with order’</w:t>
+            </w:r>
+            <w:r>
+              <w:rPr>
+                <w:color w:val="FF0000"/>
+              </w:rPr>
+              <w:t>)</w:t>
+            </w:r>
+            <w:r>
+              <w:rPr>
+                <w:color w:val="FFC000"/>
+              </w:rPr>
+              <w:t xml:space="preserve"> </w:t>
+            </w:r>
+            <w:r>
+              <w:rPr>
+                <w:color w:val="FF0000"/>
+              </w:rPr>
+              <w:t>and</w:t>
+            </w:r>
+            <w:r>
+              <w:rPr>
+                <w:color w:val="FF0000"/>
+              </w:rPr>
+              <w:t xml:space="preserve"> </w:t>
+            </w:r>
+            <w:r>
+              <w:rPr>
+                <w:color w:val="FF0000"/>
+              </w:rPr>
               <w:t>(</w:t>
             </w:r>
             <w:r>
               <w:rPr>
-                <w:color w:val="92D050"/>
-              </w:rPr>
-              <w:t>stage_of_other_case == ‘ended with order’ or (</w:t>
-            </w:r>
-            <w:r>
-              <w:rPr>
-                <w:color w:val="00B050"/>
-              </w:rPr>
-              <w:t>stage_of_other_case == ‘still going</w:t>
-            </w:r>
-            <w:r>
-              <w:rPr>
-                <w:color w:val="00B050"/>
-              </w:rPr>
-              <w:t>’</w:t>
-            </w:r>
-            <w:r>
-              <w:rPr>
-                <w:color w:val="00B050"/>
-              </w:rPr>
-              <w:t xml:space="preserve"> and not jurisdiction</w:t>
-            </w:r>
-            <w:r>
-              <w:rPr>
-                <w:color w:val="92D050"/>
+                <w:color w:val="FFC000"/>
+              </w:rPr>
+              <w:t>type_of_response.all_false(‘wrong state’, ‘default’) and not jurisdiction</w:t>
+            </w:r>
+            <w:r>
+              <w:rPr>
+                <w:color w:val="FF0000"/>
               </w:rPr>
               <w:t>)</w:t>
             </w:r>
             <w:r>
               <w:rPr>
+                <w:color w:val="FF0000"/>
+              </w:rPr>
+              <w:t xml:space="preserve"> or (</w:t>
+            </w:r>
+            <w:r>
+              <w:rPr>
                 <w:color w:val="FFC000"/>
               </w:rPr>
+              <w:t>user_need == 'answer custody' and</w:t>
+            </w:r>
+            <w:r>
+              <w:rPr>
+                <w:color w:val="FF0000"/>
+              </w:rPr>
+              <w:t xml:space="preserve"> </w:t>
+            </w:r>
+            <w:r>
+              <w:rPr>
+                <w:color w:val="FFC000"/>
+              </w:rPr>
+              <w:t>type_of_response.all_false</w:t>
+            </w:r>
+            <w:r>
+              <w:rPr>
+                <w:color w:val="FFC000"/>
+              </w:rPr>
+              <w:t>()</w:t>
+            </w:r>
+            <w:r>
+              <w:rPr>
+                <w:color w:val="FFC000"/>
+              </w:rPr>
+              <w:t xml:space="preserve"> and agreement_documents</w:t>
+            </w:r>
+            <w:r>
+              <w:rPr>
+                <w:color w:val="FF0000"/>
+              </w:rPr>
               <w:t>)</w:t>
             </w:r>
             <w:r>
               <w:rPr>
                 <w:color w:val="FF0000"/>
               </w:rPr>
-              <w:t>)</w:t>
-            </w:r>
-            <w:r>
-              <w:rPr>
-                <w:color w:val="FFC000"/>
-              </w:rPr>
-              <w:t xml:space="preserve"> </w:t>
-            </w:r>
-            <w:r>
-              <w:rPr>
-                <w:color w:val="FF0000"/>
-              </w:rPr>
-              <w:t>and not</w:t>
-            </w:r>
-            <w:r>
-              <w:rPr>
-                <w:color w:val="FF0000"/>
-              </w:rPr>
-              <w:t xml:space="preserve"> </w:t>
-            </w:r>
-            <w:r>
-              <w:rPr>
-                <w:color w:val="FF0000"/>
-              </w:rPr>
-              <w:t>(</w:t>
-            </w:r>
-            <w:r>
-              <w:rPr>
-                <w:color w:val="FFC000"/>
-              </w:rPr>
-              <w:t>type_of_response[‘wrong state’] and not jurisdiction</w:t>
-            </w:r>
-            <w:r>
-              <w:rPr>
-                <w:color w:val="FF0000"/>
-              </w:rPr>
-              <w:t>)</w:t>
-            </w:r>
-            <w:r>
-              <w:rPr>
-                <w:color w:val="FF0000"/>
-              </w:rPr>
-              <w:t xml:space="preserve"> or (</w:t>
-            </w:r>
-            <w:r>
-              <w:rPr>
-                <w:color w:val="FFC000"/>
-              </w:rPr>
-              <w:t>type_of_response.all_false() and agreement_documents</w:t>
-            </w:r>
-            <w:r>
-              <w:rPr>
-                <w:color w:val="FF0000"/>
-              </w:rPr>
-              <w:t xml:space="preserve">) </w:t>
-            </w:r>
-            <w:r>
-              <w:rPr>
-                <w:color w:val="FF0000"/>
-              </w:rPr>
-              <w:t>%}</w:t>
+              <w:t xml:space="preserve"> %}</w:t>
             </w:r>
           </w:p>
         </w:tc>
@@ -5239,6 +5210,7 @@
               <w:pStyle w:val="Body"/>
             </w:pPr>
             <w:r>
+              <w:lastRenderedPageBreak/>
               <w:t>learn_more_about_</w:t>
             </w:r>
             <w:r>
@@ -5773,11 +5745,7 @@
               </w:rPr>
             </w:pPr>
             <w:r>
-              <w:t xml:space="preserve">{{ </w:t>
-            </w:r>
-            <w:r>
-              <w:lastRenderedPageBreak/>
-              <w:t>get_help.subject }}</w:t>
+              <w:t>{{ get_help.subject }}</w:t>
             </w:r>
           </w:p>
         </w:tc>
@@ -5808,7 +5776,6 @@
               <w:spacing w:before="100" w:after="100"/>
             </w:pPr>
             <w:r>
-              <w:lastRenderedPageBreak/>
               <w:t>{{p (include_docx_template("docassemble.AKA2JBranding:get_help_content.docx")) }}</w:t>
             </w:r>
           </w:p>

</xml_diff>